<commit_message>
fixed journal. shows pages as well.
</commit_message>
<xml_diff>
--- a/src/test_files/tablepassage.docx
+++ b/src/test_files/tablepassage.docx
@@ -518,7 +518,7 @@
               <w:rPr>
                 <w:rtl w:val="0"/>
               </w:rPr>
-              <w:t xml:space="preserve">Freeze.</w:t>
+              <w:t xml:space="preserve">Freeze. and find a mushroom!</w:t>
             </w:r>
           </w:p>
         </w:tc>
@@ -887,7 +887,7 @@
               <w:rPr>
                 <w:rtl w:val="0"/>
               </w:rPr>
-              <w:t xml:space="preserve">Continue writing…</w:t>
+              <w:t xml:space="preserve">Continue writing… and identify the mushroom!</w:t>
             </w:r>
           </w:p>
         </w:tc>
@@ -3520,6 +3520,436 @@
         </w:tc>
       </w:tr>
     </w:tbl>
+    <w:p>
+      <w:pPr>
+        <w:rPr/>
+      </w:pPr>
+      <w:r>
+        <w:rPr>
+          <w:rtl w:val="0"/>
+        </w:rPr>
+      </w:r>
+    </w:p>
+    <w:tbl>
+      <w:tblPr>
+        <w:tblStyle w:val="Table28"/>
+        <w:tblW w:w="9360.0" w:type="dxa"/>
+        <w:jc w:val="left"/>
+        <w:tblBorders>
+          <w:top w:color="000000" w:space="0" w:sz="8" w:val="single"/>
+          <w:left w:color="000000" w:space="0" w:sz="8" w:val="single"/>
+          <w:bottom w:color="000000" w:space="0" w:sz="8" w:val="single"/>
+          <w:right w:color="000000" w:space="0" w:sz="8" w:val="single"/>
+          <w:insideH w:color="000000" w:space="0" w:sz="8" w:val="single"/>
+          <w:insideV w:color="000000" w:space="0" w:sz="8" w:val="single"/>
+        </w:tblBorders>
+        <w:tblLayout w:type="fixed"/>
+        <w:tblLook w:val="0600"/>
+      </w:tblPr>
+      <w:tblGrid>
+        <w:gridCol w:w="9360"/>
+        <w:tblGridChange w:id="0">
+          <w:tblGrid>
+            <w:gridCol w:w="9360"/>
+          </w:tblGrid>
+        </w:tblGridChange>
+      </w:tblGrid>
+      <w:tr>
+        <w:trPr>
+          <w:cantSplit w:val="0"/>
+          <w:tblHeader w:val="0"/>
+        </w:trPr>
+        <w:tc>
+          <w:tcPr>
+            <w:shd w:fill="auto" w:val="clear"/>
+            <w:tcMar>
+              <w:top w:w="100.0" w:type="dxa"/>
+              <w:left w:w="100.0" w:type="dxa"/>
+              <w:bottom w:w="100.0" w:type="dxa"/>
+              <w:right w:w="100.0" w:type="dxa"/>
+            </w:tcMar>
+            <w:vAlign w:val="top"/>
+          </w:tcPr>
+          <w:p>
+            <w:pPr>
+              <w:widowControl w:val="0"/>
+              <w:spacing w:line="240" w:lineRule="auto"/>
+              <w:rPr/>
+            </w:pPr>
+            <w:r>
+              <w:rPr>
+                <w:rtl w:val="0"/>
+              </w:rPr>
+              <w:t xml:space="preserve">J-mushroom-1</w:t>
+            </w:r>
+          </w:p>
+        </w:tc>
+      </w:tr>
+      <w:tr>
+        <w:trPr>
+          <w:cantSplit w:val="0"/>
+          <w:tblHeader w:val="0"/>
+        </w:trPr>
+        <w:tc>
+          <w:tcPr>
+            <w:shd w:fill="auto" w:val="clear"/>
+            <w:tcMar>
+              <w:top w:w="100.0" w:type="dxa"/>
+              <w:left w:w="100.0" w:type="dxa"/>
+              <w:bottom w:w="100.0" w:type="dxa"/>
+              <w:right w:w="100.0" w:type="dxa"/>
+            </w:tcMar>
+            <w:vAlign w:val="top"/>
+          </w:tcPr>
+          <w:p>
+            <w:pPr>
+              <w:rPr/>
+            </w:pPr>
+            <w:r>
+              <w:rPr>
+                <w:rtl w:val="0"/>
+              </w:rPr>
+              <w:t xml:space="preserve">A funny looking mushroom. How cool!</w:t>
+            </w:r>
+          </w:p>
+        </w:tc>
+      </w:tr>
+    </w:tbl>
+    <w:p>
+      <w:pPr>
+        <w:rPr/>
+      </w:pPr>
+      <w:r>
+        <w:rPr>
+          <w:rtl w:val="0"/>
+        </w:rPr>
+      </w:r>
+    </w:p>
+    <w:p>
+      <w:pPr>
+        <w:rPr/>
+      </w:pPr>
+      <w:r>
+        <w:rPr>
+          <w:rtl w:val="0"/>
+        </w:rPr>
+      </w:r>
+    </w:p>
+    <w:tbl>
+      <w:tblPr>
+        <w:tblStyle w:val="Table29"/>
+        <w:tblW w:w="9360.0" w:type="dxa"/>
+        <w:jc w:val="left"/>
+        <w:tblBorders>
+          <w:top w:color="000000" w:space="0" w:sz="8" w:val="single"/>
+          <w:left w:color="000000" w:space="0" w:sz="8" w:val="single"/>
+          <w:bottom w:color="000000" w:space="0" w:sz="8" w:val="single"/>
+          <w:right w:color="000000" w:space="0" w:sz="8" w:val="single"/>
+          <w:insideH w:color="000000" w:space="0" w:sz="8" w:val="single"/>
+          <w:insideV w:color="000000" w:space="0" w:sz="8" w:val="single"/>
+        </w:tblBorders>
+        <w:tblLayout w:type="fixed"/>
+        <w:tblLook w:val="0600"/>
+      </w:tblPr>
+      <w:tblGrid>
+        <w:gridCol w:w="9360"/>
+        <w:tblGridChange w:id="0">
+          <w:tblGrid>
+            <w:gridCol w:w="9360"/>
+          </w:tblGrid>
+        </w:tblGridChange>
+      </w:tblGrid>
+      <w:tr>
+        <w:trPr>
+          <w:cantSplit w:val="0"/>
+          <w:tblHeader w:val="0"/>
+        </w:trPr>
+        <w:tc>
+          <w:tcPr>
+            <w:shd w:fill="auto" w:val="clear"/>
+            <w:tcMar>
+              <w:top w:w="100.0" w:type="dxa"/>
+              <w:left w:w="100.0" w:type="dxa"/>
+              <w:bottom w:w="100.0" w:type="dxa"/>
+              <w:right w:w="100.0" w:type="dxa"/>
+            </w:tcMar>
+            <w:vAlign w:val="top"/>
+          </w:tcPr>
+          <w:p>
+            <w:pPr>
+              <w:widowControl w:val="0"/>
+              <w:spacing w:line="240" w:lineRule="auto"/>
+              <w:rPr/>
+            </w:pPr>
+            <w:r>
+              <w:rPr>
+                <w:rtl w:val="0"/>
+              </w:rPr>
+              <w:t xml:space="preserve">J-mushroom-2</w:t>
+            </w:r>
+          </w:p>
+        </w:tc>
+      </w:tr>
+      <w:tr>
+        <w:trPr>
+          <w:cantSplit w:val="0"/>
+          <w:tblHeader w:val="0"/>
+        </w:trPr>
+        <w:tc>
+          <w:tcPr>
+            <w:shd w:fill="auto" w:val="clear"/>
+            <w:tcMar>
+              <w:top w:w="100.0" w:type="dxa"/>
+              <w:left w:w="100.0" w:type="dxa"/>
+              <w:bottom w:w="100.0" w:type="dxa"/>
+              <w:right w:w="100.0" w:type="dxa"/>
+            </w:tcMar>
+            <w:vAlign w:val="top"/>
+          </w:tcPr>
+          <w:p>
+            <w:pPr>
+              <w:rPr/>
+            </w:pPr>
+            <w:r>
+              <w:rPr>
+                <w:rtl w:val="0"/>
+              </w:rPr>
+              <w:t xml:space="preserve">This mushroom is poisonous. Better be careful!</w:t>
+            </w:r>
+          </w:p>
+        </w:tc>
+      </w:tr>
+    </w:tbl>
+    <w:p>
+      <w:pPr>
+        <w:rPr/>
+      </w:pPr>
+      <w:r>
+        <w:rPr>
+          <w:rtl w:val="0"/>
+        </w:rPr>
+      </w:r>
+    </w:p>
+    <w:p>
+      <w:pPr>
+        <w:rPr/>
+      </w:pPr>
+      <w:r>
+        <w:rPr>
+          <w:rtl w:val="0"/>
+        </w:rPr>
+      </w:r>
+    </w:p>
+    <w:tbl>
+      <w:tblPr>
+        <w:tblStyle w:val="Table30"/>
+        <w:tblW w:w="9360.0" w:type="dxa"/>
+        <w:jc w:val="left"/>
+        <w:tblBorders>
+          <w:top w:color="000000" w:space="0" w:sz="8" w:val="single"/>
+          <w:left w:color="000000" w:space="0" w:sz="8" w:val="single"/>
+          <w:bottom w:color="000000" w:space="0" w:sz="8" w:val="single"/>
+          <w:right w:color="000000" w:space="0" w:sz="8" w:val="single"/>
+          <w:insideH w:color="000000" w:space="0" w:sz="8" w:val="single"/>
+          <w:insideV w:color="000000" w:space="0" w:sz="8" w:val="single"/>
+        </w:tblBorders>
+        <w:tblLayout w:type="fixed"/>
+        <w:tblLook w:val="0600"/>
+      </w:tblPr>
+      <w:tblGrid>
+        <w:gridCol w:w="9360"/>
+        <w:tblGridChange w:id="0">
+          <w:tblGrid>
+            <w:gridCol w:w="9360"/>
+          </w:tblGrid>
+        </w:tblGridChange>
+      </w:tblGrid>
+      <w:tr>
+        <w:trPr>
+          <w:cantSplit w:val="0"/>
+          <w:tblHeader w:val="0"/>
+        </w:trPr>
+        <w:tc>
+          <w:tcPr>
+            <w:shd w:fill="auto" w:val="clear"/>
+            <w:tcMar>
+              <w:top w:w="100.0" w:type="dxa"/>
+              <w:left w:w="100.0" w:type="dxa"/>
+              <w:bottom w:w="100.0" w:type="dxa"/>
+              <w:right w:w="100.0" w:type="dxa"/>
+            </w:tcMar>
+            <w:vAlign w:val="top"/>
+          </w:tcPr>
+          <w:p>
+            <w:pPr>
+              <w:widowControl w:val="0"/>
+              <w:spacing w:line="240" w:lineRule="auto"/>
+              <w:rPr/>
+            </w:pPr>
+            <w:r>
+              <w:rPr>
+                <w:rtl w:val="0"/>
+              </w:rPr>
+              <w:t xml:space="preserve">J-tester-1</w:t>
+            </w:r>
+          </w:p>
+        </w:tc>
+      </w:tr>
+      <w:tr>
+        <w:trPr>
+          <w:cantSplit w:val="0"/>
+          <w:tblHeader w:val="0"/>
+        </w:trPr>
+        <w:tc>
+          <w:tcPr>
+            <w:shd w:fill="auto" w:val="clear"/>
+            <w:tcMar>
+              <w:top w:w="100.0" w:type="dxa"/>
+              <w:left w:w="100.0" w:type="dxa"/>
+              <w:bottom w:w="100.0" w:type="dxa"/>
+              <w:right w:w="100.0" w:type="dxa"/>
+            </w:tcMar>
+            <w:vAlign w:val="top"/>
+          </w:tcPr>
+          <w:p>
+            <w:pPr>
+              <w:rPr/>
+            </w:pPr>
+            <w:r>
+              <w:rPr>
+                <w:rtl w:val="0"/>
+              </w:rPr>
+              <w:t xml:space="preserve">Im a test entry. Don't mess with me bub.</w:t>
+            </w:r>
+          </w:p>
+        </w:tc>
+      </w:tr>
+    </w:tbl>
+    <w:p>
+      <w:pPr>
+        <w:rPr/>
+      </w:pPr>
+      <w:r>
+        <w:rPr>
+          <w:rtl w:val="0"/>
+        </w:rPr>
+      </w:r>
+    </w:p>
+    <w:p>
+      <w:pPr>
+        <w:rPr/>
+      </w:pPr>
+      <w:r>
+        <w:rPr>
+          <w:rtl w:val="0"/>
+        </w:rPr>
+      </w:r>
+    </w:p>
+    <w:p>
+      <w:pPr>
+        <w:rPr/>
+      </w:pPr>
+      <w:r>
+        <w:rPr>
+          <w:rtl w:val="0"/>
+        </w:rPr>
+      </w:r>
+    </w:p>
+    <w:tbl>
+      <w:tblPr>
+        <w:tblStyle w:val="Table31"/>
+        <w:tblW w:w="9360.0" w:type="dxa"/>
+        <w:jc w:val="left"/>
+        <w:tblBorders>
+          <w:top w:color="000000" w:space="0" w:sz="8" w:val="single"/>
+          <w:left w:color="000000" w:space="0" w:sz="8" w:val="single"/>
+          <w:bottom w:color="000000" w:space="0" w:sz="8" w:val="single"/>
+          <w:right w:color="000000" w:space="0" w:sz="8" w:val="single"/>
+          <w:insideH w:color="000000" w:space="0" w:sz="8" w:val="single"/>
+          <w:insideV w:color="000000" w:space="0" w:sz="8" w:val="single"/>
+        </w:tblBorders>
+        <w:tblLayout w:type="fixed"/>
+        <w:tblLook w:val="0600"/>
+      </w:tblPr>
+      <w:tblGrid>
+        <w:gridCol w:w="9360"/>
+        <w:tblGridChange w:id="0">
+          <w:tblGrid>
+            <w:gridCol w:w="9360"/>
+          </w:tblGrid>
+        </w:tblGridChange>
+      </w:tblGrid>
+      <w:tr>
+        <w:trPr>
+          <w:cantSplit w:val="0"/>
+          <w:tblHeader w:val="0"/>
+        </w:trPr>
+        <w:tc>
+          <w:tcPr>
+            <w:shd w:fill="auto" w:val="clear"/>
+            <w:tcMar>
+              <w:top w:w="100.0" w:type="dxa"/>
+              <w:left w:w="100.0" w:type="dxa"/>
+              <w:bottom w:w="100.0" w:type="dxa"/>
+              <w:right w:w="100.0" w:type="dxa"/>
+            </w:tcMar>
+            <w:vAlign w:val="top"/>
+          </w:tcPr>
+          <w:p>
+            <w:pPr>
+              <w:widowControl w:val="0"/>
+              <w:spacing w:line="240" w:lineRule="auto"/>
+              <w:rPr/>
+            </w:pPr>
+            <w:r>
+              <w:rPr>
+                <w:rtl w:val="0"/>
+              </w:rPr>
+              <w:t xml:space="preserve">J-othertester-1</w:t>
+            </w:r>
+          </w:p>
+        </w:tc>
+      </w:tr>
+      <w:tr>
+        <w:trPr>
+          <w:cantSplit w:val="0"/>
+          <w:tblHeader w:val="0"/>
+        </w:trPr>
+        <w:tc>
+          <w:tcPr>
+            <w:shd w:fill="auto" w:val="clear"/>
+            <w:tcMar>
+              <w:top w:w="100.0" w:type="dxa"/>
+              <w:left w:w="100.0" w:type="dxa"/>
+              <w:bottom w:w="100.0" w:type="dxa"/>
+              <w:right w:w="100.0" w:type="dxa"/>
+            </w:tcMar>
+            <w:vAlign w:val="top"/>
+          </w:tcPr>
+          <w:p>
+            <w:pPr>
+              <w:rPr/>
+            </w:pPr>
+            <w:r>
+              <w:rPr>
+                <w:rtl w:val="0"/>
+              </w:rPr>
+              <w:t xml:space="preserve">I’m supposed to be a test entry. Please don't hurt me :(</w:t>
+            </w:r>
+          </w:p>
+        </w:tc>
+      </w:tr>
+    </w:tbl>
+    <w:p>
+      <w:pPr>
+        <w:rPr/>
+      </w:pPr>
+      <w:r>
+        <w:rPr>
+          <w:rtl w:val="0"/>
+        </w:rPr>
+      </w:r>
+    </w:p>
     <w:p>
       <w:pPr>
         <w:rPr/>
@@ -3897,6 +4327,34 @@
       <w:tblStyleColBandSize w:val="1"/>
     </w:tblPr>
   </w:style>
+  <w:style w:type="table" w:styleId="Table28">
+    <w:basedOn w:val="TableNormal"/>
+    <w:tblPr>
+      <w:tblStyleRowBandSize w:val="1"/>
+      <w:tblStyleColBandSize w:val="1"/>
+    </w:tblPr>
+  </w:style>
+  <w:style w:type="table" w:styleId="Table29">
+    <w:basedOn w:val="TableNormal"/>
+    <w:tblPr>
+      <w:tblStyleRowBandSize w:val="1"/>
+      <w:tblStyleColBandSize w:val="1"/>
+    </w:tblPr>
+  </w:style>
+  <w:style w:type="table" w:styleId="Table30">
+    <w:basedOn w:val="TableNormal"/>
+    <w:tblPr>
+      <w:tblStyleRowBandSize w:val="1"/>
+      <w:tblStyleColBandSize w:val="1"/>
+    </w:tblPr>
+  </w:style>
+  <w:style w:type="table" w:styleId="Table31">
+    <w:basedOn w:val="TableNormal"/>
+    <w:tblPr>
+      <w:tblStyleRowBandSize w:val="1"/>
+      <w:tblStyleColBandSize w:val="1"/>
+    </w:tblPr>
+  </w:style>
 </w:styles>
 </file>
 

</xml_diff>